<commit_message>
Complete student class metadata and ignore Python cache
</commit_message>
<xml_diff>
--- a/docs/实验三_多Activity_实验报告_2024110131宋珺熠.docx
+++ b/docs/实验三_多Activity_实验报告_2024110131宋珺熠.docx
@@ -92,89 +92,20 @@
           <w:tab w:val="right" w:pos="8306"/>
         </w:tabs>
         <w:rPr>
-          <w:u w:val="single"/>
-        </w:rPr>
-      </w:pPr>
-      <w:r>
-        <w:rPr>
           <w:rFonts w:hint="eastAsia" w:ascii="宋体" w:hAnsi="宋体"/>
           <w:b/>
           <w:u w:val="single"/>
-        </w:rPr>
-        <w:t>计算机科学学院</w:t>
-      </w:r>
+          <w:lang w:eastAsia="zh-CN"/>
+        </w:rPr>
+      </w:pPr>
       <w:r>
         <w:rPr>
           <w:rFonts w:hint="eastAsia" w:ascii="宋体" w:hAnsi="宋体"/>
+          <w:b/>
           <w:u w:val="single"/>
-        </w:rPr>
-        <w:t xml:space="preserve"> </w:t>
-      </w:r>
-      <w:r>
-        <w:rPr>
-          <w:rFonts w:ascii="宋体" w:hAnsi="宋体"/>
-          <w:u w:val="single"/>
-        </w:rPr>
-        <w:t xml:space="preserve">   </w:t>
-      </w:r>
-      <w:r>
-        <w:rPr>
-          <w:rFonts w:hint="eastAsia" w:ascii="宋体" w:hAnsi="宋体"/>
-        </w:rPr>
-        <w:t>级</w:t>
-      </w:r>
-      <w:r>
-        <w:rPr>
-          <w:rFonts w:hint="eastAsia" w:ascii="宋体" w:hAnsi="宋体"/>
-          <w:u w:val="single"/>
-        </w:rPr>
-        <w:t xml:space="preserve"> </w:t>
-      </w:r>
-      <w:r>
-        <w:rPr>
-          <w:rFonts w:ascii="宋体" w:hAnsi="宋体"/>
-          <w:u w:val="single"/>
-        </w:rPr>
-        <w:t xml:space="preserve"> </w:t>
-      </w:r>
-      <w:r>
-        <w:rPr>
-          <w:rFonts w:hint="eastAsia" w:ascii="宋体" w:hAnsi="宋体"/>
-        </w:rPr>
-        <w:t>班   实验名称：</w:t>
-      </w:r>
-      <w:r>
-        <w:rPr>
-          <w:rFonts w:hint="eastAsia"/>
-          <w:u w:val="single"/>
-        </w:rPr>
-        <w:t xml:space="preserve"> </w:t>
-      </w:r>
-      <w:r>
-        <w:rPr>
-          <w:u w:val="single"/>
-        </w:rPr>
-        <w:t xml:space="preserve">   </w:t>
-      </w:r>
-      <w:r>
-        <w:rPr>
-          <w:rFonts w:hint="eastAsia"/>
-          <w:u w:val="single"/>
-        </w:rPr>
-        <w:t xml:space="preserve">多Activity  </w:t>
-      </w:r>
-      <w:r>
-        <w:rPr>
-          <w:u w:val="single"/>
-        </w:rPr>
-        <w:t xml:space="preserve">  </w:t>
-      </w:r>
-      <w:r>
-        <w:rPr>
-          <w:rFonts w:hint="eastAsia"/>
-          <w:u w:val="single"/>
-        </w:rPr>
-        <w:t xml:space="preserve">  </w:t>
+          <w:lang w:eastAsia="zh-CN"/>
+        </w:rPr>
+        <w:t>计算机科学学院   2024级1班   实验名称：多Activity</w:t>
       </w:r>
     </w:p>
     <w:p>
@@ -2940,7 +2871,7 @@
     <w:lsdException w:unhideWhenUsed="0" w:uiPriority="0" w:semiHidden="0" w:name="footnote text"/>
     <w:lsdException w:unhideWhenUsed="0" w:uiPriority="0" w:semiHidden="0" w:name="annotation text"/>
     <w:lsdException w:unhideWhenUsed="0" w:uiPriority="0" w:semiHidden="0" w:name="header"/>
-    <w:lsdException w:unhideWhenUsed="0" w:uiPriority="0" w:semiHidden="0" w:name="footer"/>
+    <w:lsdException w:qFormat="1" w:unhideWhenUsed="0" w:uiPriority="0" w:semiHidden="0" w:name="footer"/>
     <w:lsdException w:unhideWhenUsed="0" w:uiPriority="0" w:semiHidden="0" w:name="index heading"/>
     <w:lsdException w:qFormat="1" w:uiPriority="0" w:name="caption"/>
     <w:lsdException w:unhideWhenUsed="0" w:uiPriority="0" w:semiHidden="0" w:name="table of figures"/>
@@ -3011,7 +2942,7 @@
     <w:lsdException w:unhideWhenUsed="0" w:uiPriority="0" w:semiHidden="0" w:name="HTML Sample"/>
     <w:lsdException w:unhideWhenUsed="0" w:uiPriority="0" w:semiHidden="0" w:name="HTML Typewriter"/>
     <w:lsdException w:unhideWhenUsed="0" w:uiPriority="0" w:semiHidden="0" w:name="HTML Variable"/>
-    <w:lsdException w:uiPriority="99" w:name="Normal Table"/>
+    <w:lsdException w:qFormat="1" w:uiPriority="99" w:name="Normal Table"/>
     <w:lsdException w:unhideWhenUsed="0" w:uiPriority="0" w:semiHidden="0" w:name="annotation subject"/>
     <w:lsdException w:uiPriority="0" w:name="Table Simple 1"/>
     <w:lsdException w:uiPriority="0" w:name="Table Simple 2"/>
@@ -3184,6 +3115,7 @@
     <w:name w:val="Normal Table"/>
     <w:semiHidden/>
     <w:unhideWhenUsed/>
+    <w:qFormat/>
     <w:uiPriority w:val="99"/>
     <w:tblPr>
       <w:tblCellMar>
@@ -3198,6 +3130,7 @@
     <w:name w:val="footer"/>
     <w:basedOn w:val="1"/>
     <w:link w:val="7"/>
+    <w:qFormat/>
     <w:uiPriority w:val="0"/>
     <w:pPr>
       <w:tabs>

</xml_diff>